<commit_message>
Edit sprint plan document
</commit_message>
<xml_diff>
--- a/Documentation/Sprint Plan.docx
+++ b/Documentation/Sprint Plan.docx
@@ -12,7 +12,7 @@
           <w:color w:val="1F3A68"/>
           <w:sz w:val="52"/>
         </w:rPr>
-        <w:t>DataForge — Sprint Plan &amp; Integration Guide</w:t>
+        <w:t>DataForge - Sprint Plan &amp; Integration Guide</w:t>
       </w:r>
     </w:p>
     <w:p>
@@ -48,7 +48,7 @@
           <w:b w:val="0"/>
           <w:sz w:val="22"/>
         </w:rPr>
-        <w:t>This is the team plan for building DataForge in sprints. Each sprint is two weeks long. The plan shows what the team will do, how parts will join together, and how we know each part works.</w:t>
+        <w:t>This is the team plan for building DataForge in sprints. Each sprint is one week long. The plan shows what the team will do, how parts will join together, and how we know each part works.</w:t>
       </w:r>
     </w:p>
     <w:p>
@@ -712,12 +712,13 @@
             </w:tcBorders>
           </w:tcPr>
           <w:p>
-            <w:r/>
+            <w:r>
+              <w:t>Sprint 0</w:t>
+            </w:r>
             <w:r>
               <w:rPr>
                 <w:sz w:val="18"/>
               </w:rPr>
-              <w:t>Sprint 0</w:t>
             </w:r>
           </w:p>
         </w:tc>
@@ -733,12 +734,13 @@
             </w:tcBorders>
           </w:tcPr>
           <w:p>
-            <w:r/>
+            <w:r>
+              <w:t>Week 1</w:t>
+            </w:r>
             <w:r>
               <w:rPr>
                 <w:sz w:val="18"/>
               </w:rPr>
-              <w:t>Week 1–2</w:t>
             </w:r>
           </w:p>
         </w:tc>
@@ -754,12 +756,13 @@
             </w:tcBorders>
           </w:tcPr>
           <w:p>
-            <w:r/>
+            <w:r>
+              <w:t>Set up project and data layer.</w:t>
+            </w:r>
             <w:r>
               <w:rPr>
                 <w:sz w:val="18"/>
               </w:rPr>
-              <w:t>Set up the project.</w:t>
             </w:r>
           </w:p>
         </w:tc>
@@ -775,12 +778,13 @@
             </w:tcBorders>
           </w:tcPr>
           <w:p>
-            <w:r/>
+            <w:r>
+              <w:t>Make the empty Visual Studio solution. Add Dear ImGui as a vendored copy. Make the main window run. Pick coding style. Add Task struct. Add TaskStore. Add load and save for `.dftasks` files. Add an atomic write.</w:t>
+            </w:r>
             <w:r>
               <w:rPr>
                 <w:sz w:val="18"/>
               </w:rPr>
-              <w:t>Make the empty Visual Studio solution. Add Dear ImGui as a vendored copy. Make the main window run. Pick coding style.</w:t>
             </w:r>
           </w:p>
         </w:tc>
@@ -796,12 +800,13 @@
             </w:tcBorders>
           </w:tcPr>
           <w:p>
-            <w:r/>
+            <w:r>
+              <w:t>Open the app. See a blank window. Close the app with no error. Write unit tests for save and load. Use sample files from `Resources/`.</w:t>
+            </w:r>
             <w:r>
               <w:rPr>
                 <w:sz w:val="18"/>
               </w:rPr>
-              <w:t>Open the app. See a blank window. Close the app with no error.</w:t>
             </w:r>
           </w:p>
         </w:tc>
@@ -817,12 +822,13 @@
             </w:tcBorders>
           </w:tcPr>
           <w:p>
-            <w:r/>
+            <w:r>
+              <w:t>Ground only. Logic and UI will plug into data next week. We test data from a small console driver.</w:t>
+            </w:r>
             <w:r>
               <w:rPr>
                 <w:sz w:val="18"/>
               </w:rPr>
-              <w:t>Nothing to join yet. We only set the ground.</w:t>
             </w:r>
           </w:p>
         </w:tc>
@@ -838,12 +844,13 @@
             </w:tcBorders>
           </w:tcPr>
           <w:p>
-            <w:r/>
+            <w:r>
+              <w:t>App opens and closes clean on Windows 10 and 11. We can save 1000 tasks and load them back with no loss.</w:t>
+            </w:r>
             <w:r>
               <w:rPr>
                 <w:sz w:val="18"/>
               </w:rPr>
-              <w:t>App opens and closes clean on Windows 10 and 11.</w:t>
             </w:r>
           </w:p>
         </w:tc>
@@ -862,12 +869,13 @@
             </w:tcBorders>
           </w:tcPr>
           <w:p>
-            <w:r/>
+            <w:r>
+              <w:t>Sprint 1</w:t>
+            </w:r>
             <w:r>
               <w:rPr>
                 <w:sz w:val="18"/>
               </w:rPr>
-              <w:t>Sprint 1</w:t>
             </w:r>
           </w:p>
         </w:tc>
@@ -884,12 +892,13 @@
             </w:tcBorders>
           </w:tcPr>
           <w:p>
-            <w:r/>
+            <w:r>
+              <w:t>Week 2</w:t>
+            </w:r>
             <w:r>
               <w:rPr>
                 <w:sz w:val="18"/>
               </w:rPr>
-              <w:t>Week 3–4</w:t>
             </w:r>
           </w:p>
         </w:tc>
@@ -906,12 +915,13 @@
             </w:tcBorders>
           </w:tcPr>
           <w:p>
-            <w:r/>
+            <w:r>
+              <w:t>Make logic layer and wire CRUD UI.</w:t>
+            </w:r>
             <w:r>
               <w:rPr>
                 <w:sz w:val="18"/>
               </w:rPr>
-              <w:t>Make the data layer.</w:t>
             </w:r>
           </w:p>
         </w:tc>
@@ -928,12 +938,13 @@
             </w:tcBorders>
           </w:tcPr>
           <w:p>
-            <w:r/>
+            <w:r>
+              <w:t>Add validation rules. Add bubble sort and quick sort. Add linear search and recursive binary search. Add the five recursive aggregate functions. Add the main task table. Add the new-task, edit-task, and delete confirm dialogs. Add status bar.</w:t>
+            </w:r>
             <w:r>
               <w:rPr>
                 <w:sz w:val="18"/>
               </w:rPr>
-              <w:t>Add Task struct. Add TaskStore. Add load and save for `.dftasks` files. Add an atomic write.</w:t>
             </w:r>
           </w:p>
         </w:tc>
@@ -950,12 +961,13 @@
             </w:tcBorders>
           </w:tcPr>
           <w:p>
-            <w:r/>
+            <w:r>
+              <w:t>Run unit tests on each rule and each algorithm. Use both empty and full stores. Run the manual QA cases in `tests/task_crud.md` and `tests/hierarchy.md`.</w:t>
+            </w:r>
             <w:r>
               <w:rPr>
                 <w:sz w:val="18"/>
               </w:rPr>
-              <w:t>Write unit tests for save and load. Use sample files from `Resources/`.</w:t>
             </w:r>
           </w:p>
         </w:tc>
@@ -972,12 +984,13 @@
             </w:tcBorders>
           </w:tcPr>
           <w:p>
-            <w:r/>
+            <w:r>
+              <w:t>Logic calls data. UI calls logic only through a small `UiState` bridge so the UI does not touch data structs by hand.</w:t>
+            </w:r>
             <w:r>
               <w:rPr>
                 <w:sz w:val="18"/>
               </w:rPr>
-              <w:t>Logic layer will call only these functions. No UI yet, so we test from a small console driver.</w:t>
             </w:r>
           </w:p>
         </w:tc>
@@ -994,12 +1007,13 @@
             </w:tcBorders>
           </w:tcPr>
           <w:p>
-            <w:r/>
+            <w:r>
+              <w:t>All logic tests pass. Bubble and quick sort give the same final order. A user can add, edit, and delete tasks with no crash.</w:t>
+            </w:r>
             <w:r>
               <w:rPr>
                 <w:sz w:val="18"/>
               </w:rPr>
-              <w:t>We can save 1000 tasks and load them back with no loss.</w:t>
             </w:r>
           </w:p>
         </w:tc>
@@ -1017,12 +1031,13 @@
             </w:tcBorders>
           </w:tcPr>
           <w:p>
-            <w:r/>
+            <w:r>
+              <w:t>Sprint 2</w:t>
+            </w:r>
             <w:r>
               <w:rPr>
                 <w:sz w:val="18"/>
               </w:rPr>
-              <w:t>Sprint 2</w:t>
             </w:r>
           </w:p>
         </w:tc>
@@ -1038,12 +1053,13 @@
             </w:tcBorders>
           </w:tcPr>
           <w:p>
-            <w:r/>
+            <w:r>
+              <w:t>Week 3</w:t>
+            </w:r>
             <w:r>
               <w:rPr>
                 <w:sz w:val="18"/>
               </w:rPr>
-              <w:t>Week 5–6</w:t>
             </w:r>
           </w:p>
         </w:tc>
@@ -1059,12 +1075,13 @@
             </w:tcBorders>
           </w:tcPr>
           <w:p>
-            <w:r/>
+            <w:r>
+              <w:t>Add search, filter, sort, stats, theme, shortcuts, productivity dashboard.</w:t>
+            </w:r>
             <w:r>
               <w:rPr>
                 <w:sz w:val="18"/>
               </w:rPr>
-              <w:t>Make the logic layer.</w:t>
             </w:r>
           </w:p>
         </w:tc>
@@ -1080,12 +1097,13 @@
             </w:tcBorders>
           </w:tcPr>
           <w:p>
-            <w:r/>
+            <w:r>
+              <w:t>Add the search box. Add the filter menu. Add the sort menu. Add the sort benchmark panel. Add the stats panel. Add light and dark theme. Add all keyboard shortcuts. Add the productivity tab with pie chart and history.</w:t>
+            </w:r>
             <w:r>
               <w:rPr>
                 <w:sz w:val="18"/>
               </w:rPr>
-              <w:t>Add validation rules. Add bubble sort and quick sort. Add linear search and recursive binary search. Add the five recursive aggregate functions.</w:t>
             </w:r>
           </w:p>
         </w:tc>
@@ -1101,12 +1119,13 @@
             </w:tcBorders>
           </w:tcPr>
           <w:p>
-            <w:r/>
+            <w:r>
+              <w:t>Run cases in `tests/search.md`, `tests/filter.md`, `tests/sort.md`, `tests/benchmark.md`, `tests/statistics.md`, `tests/theme.md`, `tests/shortcuts.md`, `tests/productivity.md`.</w:t>
+            </w:r>
             <w:r>
               <w:rPr>
                 <w:sz w:val="18"/>
               </w:rPr>
-              <w:t>Run unit tests on each rule and each algorithm. Use both empty and full stores.</w:t>
             </w:r>
           </w:p>
         </w:tc>
@@ -1122,12 +1141,13 @@
             </w:tcBorders>
           </w:tcPr>
           <w:p>
-            <w:r/>
+            <w:r>
+              <w:t>Thin presentation adapter turns user clicks into logic calls. Theme and shortcuts plug into `UiState`. Productivity reads from logic aggregates only. No new logic code.</w:t>
+            </w:r>
             <w:r>
               <w:rPr>
                 <w:sz w:val="18"/>
               </w:rPr>
-              <w:t>Logic calls data. UI not added yet. We will wire it in Sprint 3.</w:t>
             </w:r>
           </w:p>
         </w:tc>
@@ -1143,12 +1163,13 @@
             </w:tcBorders>
           </w:tcPr>
           <w:p>
-            <w:r/>
+            <w:r>
+              <w:t>Search, filter, and both sorts work on a store of 5000 tasks. Pie chart updates when tasks change. Theme persists across runs.</w:t>
+            </w:r>
             <w:r>
               <w:rPr>
                 <w:sz w:val="18"/>
               </w:rPr>
-              <w:t>All logic tests pass. Bubble and quick sort give the same final order.</w:t>
             </w:r>
           </w:p>
         </w:tc>
@@ -1167,12 +1188,13 @@
             </w:tcBorders>
           </w:tcPr>
           <w:p>
-            <w:r/>
+            <w:r>
+              <w:t>Sprint 3</w:t>
+            </w:r>
             <w:r>
               <w:rPr>
                 <w:sz w:val="18"/>
               </w:rPr>
-              <w:t>Sprint 3</w:t>
             </w:r>
           </w:p>
         </w:tc>
@@ -1189,12 +1211,13 @@
             </w:tcBorders>
           </w:tcPr>
           <w:p>
-            <w:r/>
+            <w:r>
+              <w:t>Week 4</w:t>
+            </w:r>
             <w:r>
               <w:rPr>
                 <w:sz w:val="18"/>
               </w:rPr>
-              <w:t>Week 7–8</w:t>
             </w:r>
           </w:p>
         </w:tc>
@@ -1211,12 +1234,13 @@
             </w:tcBorders>
           </w:tcPr>
           <w:p>
-            <w:r/>
+            <w:r>
+              <w:t>Polish and ship.</w:t>
+            </w:r>
             <w:r>
               <w:rPr>
                 <w:sz w:val="18"/>
               </w:rPr>
-              <w:t>Wire the UI to the logic.</w:t>
             </w:r>
           </w:p>
         </w:tc>
@@ -1233,12 +1257,13 @@
             </w:tcBorders>
           </w:tcPr>
           <w:p>
-            <w:r/>
+            <w:r>
+              <w:t>Fix bugs from QA. Add toasts. Add help panel. Add voice input. Make the installer.</w:t>
+            </w:r>
             <w:r>
               <w:rPr>
                 <w:sz w:val="18"/>
               </w:rPr>
-              <w:t>Add the main task table. Add the new-task dialog. Add the edit-task dialog. Add the delete confirm dialog. Add status bar.</w:t>
             </w:r>
           </w:p>
         </w:tc>
@@ -1255,12 +1280,13 @@
             </w:tcBorders>
           </w:tcPr>
           <w:p>
-            <w:r/>
+            <w:r>
+              <w:t>Full regression run of every file in `tests/`. Smoke test on a clean Windows VM.</w:t>
+            </w:r>
             <w:r>
               <w:rPr>
                 <w:sz w:val="18"/>
               </w:rPr>
-              <w:t>Run the manual QA cases in `tests/task_crud.md` and `tests/hierarchy.md`.</w:t>
             </w:r>
           </w:p>
         </w:tc>
@@ -1277,12 +1303,13 @@
             </w:tcBorders>
           </w:tcPr>
           <w:p>
-            <w:r/>
+            <w:r>
+              <w:t>No new layers added. Only small fixes that respect the three-tier rule.</w:t>
+            </w:r>
             <w:r>
               <w:rPr>
                 <w:sz w:val="18"/>
               </w:rPr>
-              <w:t>UI calls logic only. We add a small `UiState` struct as a bridge so the UI does not touch data structs by hand.</w:t>
             </w:r>
           </w:p>
         </w:tc>
@@ -1299,466 +1326,13 @@
             </w:tcBorders>
           </w:tcPr>
           <w:p>
-            <w:r/>
+            <w:r>
+              <w:t>All High-priority QA cases pass. Installer runs on a fresh Windows 11 box.</w:t>
+            </w:r>
             <w:r>
               <w:rPr>
                 <w:sz w:val="18"/>
               </w:rPr>
-              <w:t>A user can add, edit, and delete tasks with no crash.</w:t>
-            </w:r>
-          </w:p>
-        </w:tc>
-      </w:tr>
-      <w:tr>
-        <w:tc>
-          <w:tcPr>
-            <w:tcW w:type="dxa" w:w="907"/>
-            <w:vAlign w:val="top"/>
-            <w:tcBorders>
-              <w:top w:val="single" w:sz="6" w:color="888888"/>
-              <w:left w:val="single" w:sz="6" w:color="888888"/>
-              <w:bottom w:val="single" w:sz="6" w:color="888888"/>
-              <w:right w:val="single" w:sz="6" w:color="888888"/>
-            </w:tcBorders>
-          </w:tcPr>
-          <w:p>
-            <w:r/>
-            <w:r>
-              <w:rPr>
-                <w:sz w:val="18"/>
-              </w:rPr>
-              <w:t>Sprint 4</w:t>
-            </w:r>
-          </w:p>
-        </w:tc>
-        <w:tc>
-          <w:tcPr>
-            <w:tcW w:type="dxa" w:w="907"/>
-            <w:vAlign w:val="top"/>
-            <w:tcBorders>
-              <w:top w:val="single" w:sz="6" w:color="888888"/>
-              <w:left w:val="single" w:sz="6" w:color="888888"/>
-              <w:bottom w:val="single" w:sz="6" w:color="888888"/>
-              <w:right w:val="single" w:sz="6" w:color="888888"/>
-            </w:tcBorders>
-          </w:tcPr>
-          <w:p>
-            <w:r/>
-            <w:r>
-              <w:rPr>
-                <w:sz w:val="18"/>
-              </w:rPr>
-              <w:t>Week 9–10</w:t>
-            </w:r>
-          </w:p>
-        </w:tc>
-        <w:tc>
-          <w:tcPr>
-            <w:tcW w:type="dxa" w:w="1361"/>
-            <w:vAlign w:val="top"/>
-            <w:tcBorders>
-              <w:top w:val="single" w:sz="6" w:color="888888"/>
-              <w:left w:val="single" w:sz="6" w:color="888888"/>
-              <w:bottom w:val="single" w:sz="6" w:color="888888"/>
-              <w:right w:val="single" w:sz="6" w:color="888888"/>
-            </w:tcBorders>
-          </w:tcPr>
-          <w:p>
-            <w:r/>
-            <w:r>
-              <w:rPr>
-                <w:sz w:val="18"/>
-              </w:rPr>
-              <w:t>Add search, filter, sort UI.</w:t>
-            </w:r>
-          </w:p>
-        </w:tc>
-        <w:tc>
-          <w:tcPr>
-            <w:tcW w:type="dxa" w:w="2268"/>
-            <w:vAlign w:val="top"/>
-            <w:tcBorders>
-              <w:top w:val="single" w:sz="6" w:color="888888"/>
-              <w:left w:val="single" w:sz="6" w:color="888888"/>
-              <w:bottom w:val="single" w:sz="6" w:color="888888"/>
-              <w:right w:val="single" w:sz="6" w:color="888888"/>
-            </w:tcBorders>
-          </w:tcPr>
-          <w:p>
-            <w:r/>
-            <w:r>
-              <w:rPr>
-                <w:sz w:val="18"/>
-              </w:rPr>
-              <w:t>Add the search box. Add the filter menu. Add the sort menu. Add the sort benchmark panel.</w:t>
-            </w:r>
-          </w:p>
-        </w:tc>
-        <w:tc>
-          <w:tcPr>
-            <w:tcW w:type="dxa" w:w="1928"/>
-            <w:vAlign w:val="top"/>
-            <w:tcBorders>
-              <w:top w:val="single" w:sz="6" w:color="888888"/>
-              <w:left w:val="single" w:sz="6" w:color="888888"/>
-              <w:bottom w:val="single" w:sz="6" w:color="888888"/>
-              <w:right w:val="single" w:sz="6" w:color="888888"/>
-            </w:tcBorders>
-          </w:tcPr>
-          <w:p>
-            <w:r/>
-            <w:r>
-              <w:rPr>
-                <w:sz w:val="18"/>
-              </w:rPr>
-              <w:t>Run cases in `tests/search.md`, `tests/filter.md`, `tests/sort.md`, `tests/benchmark.md`.</w:t>
-            </w:r>
-          </w:p>
-        </w:tc>
-        <w:tc>
-          <w:tcPr>
-            <w:tcW w:type="dxa" w:w="1928"/>
-            <w:vAlign w:val="top"/>
-            <w:tcBorders>
-              <w:top w:val="single" w:sz="6" w:color="888888"/>
-              <w:left w:val="single" w:sz="6" w:color="888888"/>
-              <w:bottom w:val="single" w:sz="6" w:color="888888"/>
-              <w:right w:val="single" w:sz="6" w:color="888888"/>
-            </w:tcBorders>
-          </w:tcPr>
-          <w:p>
-            <w:r/>
-            <w:r>
-              <w:rPr>
-                <w:sz w:val="18"/>
-              </w:rPr>
-              <w:t>We add a thin adapter in the presentation layer that turns user clicks into logic calls. No new logic code.</w:t>
-            </w:r>
-          </w:p>
-        </w:tc>
-        <w:tc>
-          <w:tcPr>
-            <w:tcW w:type="dxa" w:w="1474"/>
-            <w:vAlign w:val="top"/>
-            <w:tcBorders>
-              <w:top w:val="single" w:sz="6" w:color="888888"/>
-              <w:left w:val="single" w:sz="6" w:color="888888"/>
-              <w:bottom w:val="single" w:sz="6" w:color="888888"/>
-              <w:right w:val="single" w:sz="6" w:color="888888"/>
-            </w:tcBorders>
-          </w:tcPr>
-          <w:p>
-            <w:r/>
-            <w:r>
-              <w:rPr>
-                <w:sz w:val="18"/>
-              </w:rPr>
-              <w:t>Search, filter, and both sorts work on a store of 5000 tasks.</w:t>
-            </w:r>
-          </w:p>
-        </w:tc>
-      </w:tr>
-      <w:tr>
-        <w:tc>
-          <w:tcPr>
-            <w:tcW w:type="dxa" w:w="907"/>
-            <w:vAlign w:val="top"/>
-            <w:shd w:val="clear" w:color="auto" w:fill="F2F5FA"/>
-            <w:tcBorders>
-              <w:top w:val="single" w:sz="6" w:color="888888"/>
-              <w:left w:val="single" w:sz="6" w:color="888888"/>
-              <w:bottom w:val="single" w:sz="6" w:color="888888"/>
-              <w:right w:val="single" w:sz="6" w:color="888888"/>
-            </w:tcBorders>
-          </w:tcPr>
-          <w:p>
-            <w:r/>
-            <w:r>
-              <w:rPr>
-                <w:sz w:val="18"/>
-              </w:rPr>
-              <w:t>Sprint 5</w:t>
-            </w:r>
-          </w:p>
-        </w:tc>
-        <w:tc>
-          <w:tcPr>
-            <w:tcW w:type="dxa" w:w="907"/>
-            <w:vAlign w:val="top"/>
-            <w:shd w:val="clear" w:color="auto" w:fill="F2F5FA"/>
-            <w:tcBorders>
-              <w:top w:val="single" w:sz="6" w:color="888888"/>
-              <w:left w:val="single" w:sz="6" w:color="888888"/>
-              <w:bottom w:val="single" w:sz="6" w:color="888888"/>
-              <w:right w:val="single" w:sz="6" w:color="888888"/>
-            </w:tcBorders>
-          </w:tcPr>
-          <w:p>
-            <w:r/>
-            <w:r>
-              <w:rPr>
-                <w:sz w:val="18"/>
-              </w:rPr>
-              <w:t>Week 11–12</w:t>
-            </w:r>
-          </w:p>
-        </w:tc>
-        <w:tc>
-          <w:tcPr>
-            <w:tcW w:type="dxa" w:w="1361"/>
-            <w:vAlign w:val="top"/>
-            <w:shd w:val="clear" w:color="auto" w:fill="F2F5FA"/>
-            <w:tcBorders>
-              <w:top w:val="single" w:sz="6" w:color="888888"/>
-              <w:left w:val="single" w:sz="6" w:color="888888"/>
-              <w:bottom w:val="single" w:sz="6" w:color="888888"/>
-              <w:right w:val="single" w:sz="6" w:color="888888"/>
-            </w:tcBorders>
-          </w:tcPr>
-          <w:p>
-            <w:r/>
-            <w:r>
-              <w:rPr>
-                <w:sz w:val="18"/>
-              </w:rPr>
-              <w:t>Add stats, theme, shortcuts, productivity dashboard.</w:t>
-            </w:r>
-          </w:p>
-        </w:tc>
-        <w:tc>
-          <w:tcPr>
-            <w:tcW w:type="dxa" w:w="2268"/>
-            <w:vAlign w:val="top"/>
-            <w:shd w:val="clear" w:color="auto" w:fill="F2F5FA"/>
-            <w:tcBorders>
-              <w:top w:val="single" w:sz="6" w:color="888888"/>
-              <w:left w:val="single" w:sz="6" w:color="888888"/>
-              <w:bottom w:val="single" w:sz="6" w:color="888888"/>
-              <w:right w:val="single" w:sz="6" w:color="888888"/>
-            </w:tcBorders>
-          </w:tcPr>
-          <w:p>
-            <w:r/>
-            <w:r>
-              <w:rPr>
-                <w:sz w:val="18"/>
-              </w:rPr>
-              <w:t>Add the stats panel. Add light and dark theme. Add all keyboard shortcuts. Add the productivity tab with pie chart and history.</w:t>
-            </w:r>
-          </w:p>
-        </w:tc>
-        <w:tc>
-          <w:tcPr>
-            <w:tcW w:type="dxa" w:w="1928"/>
-            <w:vAlign w:val="top"/>
-            <w:shd w:val="clear" w:color="auto" w:fill="F2F5FA"/>
-            <w:tcBorders>
-              <w:top w:val="single" w:sz="6" w:color="888888"/>
-              <w:left w:val="single" w:sz="6" w:color="888888"/>
-              <w:bottom w:val="single" w:sz="6" w:color="888888"/>
-              <w:right w:val="single" w:sz="6" w:color="888888"/>
-            </w:tcBorders>
-          </w:tcPr>
-          <w:p>
-            <w:r/>
-            <w:r>
-              <w:rPr>
-                <w:sz w:val="18"/>
-              </w:rPr>
-              <w:t>Run cases in `tests/statistics.md`, `tests/theme.md`, `tests/shortcuts.md`, `tests/productivity.md`.</w:t>
-            </w:r>
-          </w:p>
-        </w:tc>
-        <w:tc>
-          <w:tcPr>
-            <w:tcW w:type="dxa" w:w="1928"/>
-            <w:vAlign w:val="top"/>
-            <w:shd w:val="clear" w:color="auto" w:fill="F2F5FA"/>
-            <w:tcBorders>
-              <w:top w:val="single" w:sz="6" w:color="888888"/>
-              <w:left w:val="single" w:sz="6" w:color="888888"/>
-              <w:bottom w:val="single" w:sz="6" w:color="888888"/>
-              <w:right w:val="single" w:sz="6" w:color="888888"/>
-            </w:tcBorders>
-          </w:tcPr>
-          <w:p>
-            <w:r/>
-            <w:r>
-              <w:rPr>
-                <w:sz w:val="18"/>
-              </w:rPr>
-              <w:t>Theme and shortcuts plug into `UiState`. Productivity reads from logic aggregates only.</w:t>
-            </w:r>
-          </w:p>
-        </w:tc>
-        <w:tc>
-          <w:tcPr>
-            <w:tcW w:type="dxa" w:w="1474"/>
-            <w:vAlign w:val="top"/>
-            <w:shd w:val="clear" w:color="auto" w:fill="F2F5FA"/>
-            <w:tcBorders>
-              <w:top w:val="single" w:sz="6" w:color="888888"/>
-              <w:left w:val="single" w:sz="6" w:color="888888"/>
-              <w:bottom w:val="single" w:sz="6" w:color="888888"/>
-              <w:right w:val="single" w:sz="6" w:color="888888"/>
-            </w:tcBorders>
-          </w:tcPr>
-          <w:p>
-            <w:r/>
-            <w:r>
-              <w:rPr>
-                <w:sz w:val="18"/>
-              </w:rPr>
-              <w:t>Pie chart updates when tasks change. Theme persists across runs.</w:t>
-            </w:r>
-          </w:p>
-        </w:tc>
-      </w:tr>
-      <w:tr>
-        <w:tc>
-          <w:tcPr>
-            <w:tcW w:type="dxa" w:w="907"/>
-            <w:vAlign w:val="top"/>
-            <w:tcBorders>
-              <w:top w:val="single" w:sz="6" w:color="888888"/>
-              <w:left w:val="single" w:sz="6" w:color="888888"/>
-              <w:bottom w:val="single" w:sz="6" w:color="888888"/>
-              <w:right w:val="single" w:sz="6" w:color="888888"/>
-            </w:tcBorders>
-          </w:tcPr>
-          <w:p>
-            <w:r/>
-            <w:r>
-              <w:rPr>
-                <w:sz w:val="18"/>
-              </w:rPr>
-              <w:t>Sprint 6</w:t>
-            </w:r>
-          </w:p>
-        </w:tc>
-        <w:tc>
-          <w:tcPr>
-            <w:tcW w:type="dxa" w:w="907"/>
-            <w:vAlign w:val="top"/>
-            <w:tcBorders>
-              <w:top w:val="single" w:sz="6" w:color="888888"/>
-              <w:left w:val="single" w:sz="6" w:color="888888"/>
-              <w:bottom w:val="single" w:sz="6" w:color="888888"/>
-              <w:right w:val="single" w:sz="6" w:color="888888"/>
-            </w:tcBorders>
-          </w:tcPr>
-          <w:p>
-            <w:r/>
-            <w:r>
-              <w:rPr>
-                <w:sz w:val="18"/>
-              </w:rPr>
-              <w:t>Week 13–14</w:t>
-            </w:r>
-          </w:p>
-        </w:tc>
-        <w:tc>
-          <w:tcPr>
-            <w:tcW w:type="dxa" w:w="1361"/>
-            <w:vAlign w:val="top"/>
-            <w:tcBorders>
-              <w:top w:val="single" w:sz="6" w:color="888888"/>
-              <w:left w:val="single" w:sz="6" w:color="888888"/>
-              <w:bottom w:val="single" w:sz="6" w:color="888888"/>
-              <w:right w:val="single" w:sz="6" w:color="888888"/>
-            </w:tcBorders>
-          </w:tcPr>
-          <w:p>
-            <w:r/>
-            <w:r>
-              <w:rPr>
-                <w:sz w:val="18"/>
-              </w:rPr>
-              <w:t>Polish and ship.</w:t>
-            </w:r>
-          </w:p>
-        </w:tc>
-        <w:tc>
-          <w:tcPr>
-            <w:tcW w:type="dxa" w:w="2268"/>
-            <w:vAlign w:val="top"/>
-            <w:tcBorders>
-              <w:top w:val="single" w:sz="6" w:color="888888"/>
-              <w:left w:val="single" w:sz="6" w:color="888888"/>
-              <w:bottom w:val="single" w:sz="6" w:color="888888"/>
-              <w:right w:val="single" w:sz="6" w:color="888888"/>
-            </w:tcBorders>
-          </w:tcPr>
-          <w:p>
-            <w:r/>
-            <w:r>
-              <w:rPr>
-                <w:sz w:val="18"/>
-              </w:rPr>
-              <w:t>Fix bugs from QA. Add toasts. Add help panel. Add voice input. Make the installer.</w:t>
-            </w:r>
-          </w:p>
-        </w:tc>
-        <w:tc>
-          <w:tcPr>
-            <w:tcW w:type="dxa" w:w="1928"/>
-            <w:vAlign w:val="top"/>
-            <w:tcBorders>
-              <w:top w:val="single" w:sz="6" w:color="888888"/>
-              <w:left w:val="single" w:sz="6" w:color="888888"/>
-              <w:bottom w:val="single" w:sz="6" w:color="888888"/>
-              <w:right w:val="single" w:sz="6" w:color="888888"/>
-            </w:tcBorders>
-          </w:tcPr>
-          <w:p>
-            <w:r/>
-            <w:r>
-              <w:rPr>
-                <w:sz w:val="18"/>
-              </w:rPr>
-              <w:t>Full regression run of every file in `tests/`. Smoke test on a clean Windows VM.</w:t>
-            </w:r>
-          </w:p>
-        </w:tc>
-        <w:tc>
-          <w:tcPr>
-            <w:tcW w:type="dxa" w:w="1928"/>
-            <w:vAlign w:val="top"/>
-            <w:tcBorders>
-              <w:top w:val="single" w:sz="6" w:color="888888"/>
-              <w:left w:val="single" w:sz="6" w:color="888888"/>
-              <w:bottom w:val="single" w:sz="6" w:color="888888"/>
-              <w:right w:val="single" w:sz="6" w:color="888888"/>
-            </w:tcBorders>
-          </w:tcPr>
-          <w:p>
-            <w:r/>
-            <w:r>
-              <w:rPr>
-                <w:sz w:val="18"/>
-              </w:rPr>
-              <w:t>No new layers added. Only small fixes that respect the three-tier rule.</w:t>
-            </w:r>
-          </w:p>
-        </w:tc>
-        <w:tc>
-          <w:tcPr>
-            <w:tcW w:type="dxa" w:w="1474"/>
-            <w:vAlign w:val="top"/>
-            <w:tcBorders>
-              <w:top w:val="single" w:sz="6" w:color="888888"/>
-              <w:left w:val="single" w:sz="6" w:color="888888"/>
-              <w:bottom w:val="single" w:sz="6" w:color="888888"/>
-              <w:right w:val="single" w:sz="6" w:color="888888"/>
-            </w:tcBorders>
-          </w:tcPr>
-          <w:p>
-            <w:r/>
-            <w:r>
-              <w:rPr>
-                <w:sz w:val="18"/>
-              </w:rPr>
-              <w:t>All High-priority QA cases pass. Installer runs on a fresh Windows 11 box.</w:t>
             </w:r>
           </w:p>
         </w:tc>

</xml_diff>